<commit_message>
Refactored API actions docs
Co-authored-by: NeoMatrix76 <261109629+NeoMatrix76@users.noreply.github.com>
</commit_message>
<xml_diff>
--- a/public/docs/ROLOS-Developer-REST-API-v3.docx
+++ b/public/docs/ROLOS-Developer-REST-API-v3.docx
@@ -1852,6 +1852,97 @@
               <w:fldChar w:fldCharType="end"/>
             </w:r>
           </w:hyperlink>
+        </w:p>
+        <w:p>
+          <w:pPr>
+            <w:pStyle w:val="Heading2"/>
+          </w:pPr>
+          <w:r>
+            <w:t>9.5 UI Configuration</w:t>
+          </w:r>
+        </w:p>
+        <w:p>
+          <w:pPr>
+            <w:spacing w:after="120"/>
+          </w:pPr>
+          <w:r>
+            <w:rPr>
+              <w:b/>
+              <w:bCs/>
+              <w:color w:val="E91E8C"/>
+            </w:rPr>
+            <w:t>get_ui_config</w:t>
+          </w:r>
+        </w:p>
+        <w:p>
+          <w:r>
+            <w:t>Returns the merged UI configuration (global defaults + property overrides) for Gutenberg blocks, WP admin dashboard tabs, embed widgets, Smart Book button defaults, and API Gates that control which PMS actions are enabled per property.</w:t>
+          </w:r>
+        </w:p>
+        <w:p>
+          <w:pPr>
+            <w:spacing w:before="120"/>
+          </w:pPr>
+          <w:r>
+            <w:rPr>
+              <w:b/>
+              <w:bCs/>
+            </w:rPr>
+            <w:t>Parameters:</w:t>
+          </w:r>
+        </w:p>
+        <w:p>
+          <w:pPr>
+            <w:pStyle w:val="ListParagraph"/>
+            <w:numPr>
+              <w:ilvl w:val="0"/>
+              <w:numId w:val="1"/>
+            </w:numPr>
+          </w:pPr>
+          <w:r>
+            <w:rPr>
+              <w:b/>
+              <w:bCs/>
+            </w:rPr>
+            <w:t>propertyId</w:t>
+          </w:r>
+          <w:r>
+            <w:t xml:space="preserve"> (UUID, required) — Property identifier</w:t>
+          </w:r>
+        </w:p>
+        <w:p>
+          <w:pPr>
+            <w:pStyle w:val="ListParagraph"/>
+            <w:numPr>
+              <w:ilvl w:val="0"/>
+              <w:numId w:val="1"/>
+            </w:numPr>
+          </w:pPr>
+          <w:r>
+            <w:rPr>
+              <w:b/>
+              <w:bCs/>
+            </w:rPr>
+            <w:t>component_type</w:t>
+          </w:r>
+          <w:r>
+            <w:t xml:space="preserve"> (string, optional) — Filter by component: gutenberg_blocks, wp_admin, embed_widgets, smart_button, api_gates</w:t>
+          </w:r>
+        </w:p>
+        <w:p>
+          <w:pPr>
+            <w:spacing w:before="120"/>
+          </w:pPr>
+          <w:r>
+            <w:rPr>
+              <w:b/>
+              <w:bCs/>
+            </w:rPr>
+            <w:t>Response:</w:t>
+          </w:r>
+          <w:r>
+            <w:t xml:space="preserve"> Returns a merged configuration object containing all UI component settings and API gate states for the property.</w:t>
+          </w:r>
         </w:p>
         <w:p>
           <w:pPr>

</xml_diff>